<commit_message>
Replace Q6 visualization with Q4 Data Type Optimization Challenge
</commit_message>
<xml_diff>
--- a/MA2411020010018_KaranPullagal_DS_Lab_Assignment.docx
+++ b/MA2411020010018_KaranPullagal_DS_Lab_Assignment.docx
@@ -4,10 +4,10 @@
   <w:body>
     <w:p>
       <w:pPr>
-        <w:pStyle w:val="Title"/>
+        <w:pStyle w:val="Heading1"/>
       </w:pPr>
       <w:r>
-        <w:t>Data Science Lab Assignment</w:t>
+        <w:t>Title Page</w:t>
       </w:r>
     </w:p>
     <w:p>
@@ -27,8 +27,11 @@
     </w:p>
     <w:p>
       <w:r>
-        <w:t xml:space="preserve">GitHub Repository Link: </w:t>
+        <w:br/>
+        <w:t>GitHub Repository Link:</w:t>
       </w:r>
+    </w:p>
+    <w:p>
       <w:r>
         <w:rPr>
           <w:u w:val="single"/>
@@ -38,7 +41,29 @@
     </w:p>
     <w:p>
       <w:r>
-        <w:t>Question Numbers Attempted: Q1, Q2, Q6</w:t>
+        <w:br/>
+      </w:r>
+    </w:p>
+    <w:p>
+      <w:pPr>
+        <w:pStyle w:val="Heading2"/>
+      </w:pPr>
+      <w:r>
+        <w:t>Questions Attempted</w:t>
+      </w:r>
+    </w:p>
+    <w:p>
+      <w:r>
+        <w:t>Module 1:</w:t>
+        <w:br/>
+        <w:t>Q1 - Smart Missing Value Handling with Business Rules</w:t>
+        <w:br/>
+        <w:t>Q2 - Complex String Manipulation with Duplicate Handling</w:t>
+        <w:br/>
+        <w:br/>
+        <w:t>Module 2:</w:t>
+        <w:br/>
+        <w:t>Q4 - Data Type Optimization Challenge</w:t>
       </w:r>
     </w:p>
     <w:p>
@@ -51,7 +76,7 @@
         <w:pStyle w:val="Heading1"/>
       </w:pPr>
       <w:r>
-        <w:t>Q1</w:t>
+        <w:t>🔹 Q1: Smart Missing Value Handling with Business Rules</w:t>
       </w:r>
     </w:p>
     <w:p>
@@ -64,9 +89,7 @@
     </w:p>
     <w:p>
       <w:r>
-        <w:t>Q1. Smart Missing Value Handling with Business Rules.</w:t>
-        <w:br/>
-        <w:t>Fill missing SalesAmount using median of ProductCategory and Region, or overall Category median. Create Imputation_Method column.</w:t>
+        <w:t>Some SalesAmount values are missing only for "Electronics" category in "South" region. Fills missing SalesAmount using the median of the same ProductCategory and Region. If the median cannot be calculated, use the overall median of that ProductCategory. Create an Imputation_Method column.</w:t>
       </w:r>
     </w:p>
     <w:p>
@@ -74,12 +97,63 @@
         <w:pStyle w:val="Heading2"/>
       </w:pPr>
       <w:r>
-        <w:t>Approach / Logic used</w:t>
+        <w:t>Approach / Logic Used</w:t>
       </w:r>
     </w:p>
     <w:p>
+      <w:pPr>
+        <w:pStyle w:val="ListBullet"/>
+      </w:pPr>
       <w:r>
-        <w:t>Grouped data by (ProductCategory, Region) for regional median and (ProductCategory) for category median. Used boolean masks to conditionally fill missing values and record imputation method.</w:t>
+        <w:t>Loaded dataset using pandas</w:t>
+      </w:r>
+    </w:p>
+    <w:p>
+      <w:pPr>
+        <w:pStyle w:val="ListBullet"/>
+      </w:pPr>
+      <w:r>
+        <w:t>Identified missing values in SalesAmount</w:t>
+      </w:r>
+    </w:p>
+    <w:p>
+      <w:pPr>
+        <w:pStyle w:val="ListBullet"/>
+      </w:pPr>
+      <w:r>
+        <w:t>Applied conditional median:</w:t>
+      </w:r>
+    </w:p>
+    <w:p>
+      <w:pPr>
+        <w:pStyle w:val="ListBullet"/>
+      </w:pPr>
+      <w:r>
+        <w:t xml:space="preserve">  * First → Region + ProductCategory median</w:t>
+      </w:r>
+    </w:p>
+    <w:p>
+      <w:pPr>
+        <w:pStyle w:val="ListBullet"/>
+      </w:pPr>
+      <w:r>
+        <w:t xml:space="preserve">  * If not available → Category median</w:t>
+      </w:r>
+    </w:p>
+    <w:p>
+      <w:pPr>
+        <w:pStyle w:val="ListBullet"/>
+      </w:pPr>
+      <w:r>
+        <w:t>Created new column to track method used</w:t>
+      </w:r>
+    </w:p>
+    <w:p>
+      <w:pPr>
+        <w:pStyle w:val="ListBullet"/>
+      </w:pPr>
+      <w:r>
+        <w:t>Saved cleaned dataset</w:t>
       </w:r>
     </w:p>
     <w:p>
@@ -87,7 +161,7 @@
         <w:pStyle w:val="Heading2"/>
       </w:pPr>
       <w:r>
-        <w:t>Complete Python Code</w:t>
+        <w:t>Python Code</w:t>
       </w:r>
     </w:p>
     <w:p>
@@ -97,6 +171,7 @@
       <w:r>
         <w:rPr>
           <w:rFonts w:ascii="Courier New" w:hAnsi="Courier New"/>
+          <w:color w:val="2B2B2B"/>
           <w:sz w:val="18"/>
         </w:rPr>
         <w:t>import pandas as pd</w:t>
@@ -121,6 +196,8 @@
         <w:t xml:space="preserve">    # Create the Imputation_Method column</w:t>
         <w:br/>
         <w:t xml:space="preserve">    df['Imputation_Method'] = np.nan</w:t>
+        <w:br/>
+        <w:t xml:space="preserve">    df['Imputation_Method'] = df['Imputation_Method'].astype('object')</w:t>
         <w:br/>
         <w:t xml:space="preserve">    </w:t>
         <w:br/>
@@ -191,26 +268,43 @@
         <w:pStyle w:val="Heading2"/>
       </w:pPr>
       <w:r>
-        <w:t>Output / Results</w:t>
+        <w:t>Output</w:t>
       </w:r>
     </w:p>
     <w:p>
-      <w:pPr>
-        <w:pStyle w:val="NoSpacing"/>
-      </w:pPr>
       <w:r>
-        <w:rPr>
-          <w:rFonts w:ascii="Courier New" w:hAnsi="Courier New"/>
-          <w:sz w:val="20"/>
-        </w:rPr>
-        <w:t>Missing values filled using each method:</w:t>
-        <w:br/>
-        <w:t>Imputation_Method</w:t>
-        <w:br/>
-        <w:t>Regional_Median    6</w:t>
-        <w:br/>
-        <w:t>Name: count, dtype: int64</w:t>
-        <w:br/>
+        <w:drawing>
+          <wp:inline xmlns:a="http://schemas.openxmlformats.org/drawingml/2006/main" xmlns:pic="http://schemas.openxmlformats.org/drawingml/2006/picture">
+            <wp:extent cx="5080000" cy="1693333"/>
+            <wp:docPr id="1" name="Picture 1"/>
+            <wp:cNvGraphicFramePr>
+              <a:graphicFrameLocks noChangeAspect="1"/>
+            </wp:cNvGraphicFramePr>
+            <a:graphic>
+              <a:graphicData uri="http://schemas.openxmlformats.org/drawingml/2006/picture">
+                <pic:pic>
+                  <pic:nvPicPr>
+                    <pic:cNvPr id="0" name="Q1_output_screenshot.png"/>
+                    <pic:cNvPicPr/>
+                  </pic:nvPicPr>
+                  <pic:blipFill>
+                    <a:blip r:embed="rId9"/>
+                    <a:stretch>
+                      <a:fillRect/>
+                    </a:stretch>
+                  </pic:blipFill>
+                  <pic:spPr>
+                    <a:xfrm>
+                      <a:off x="0" y="0"/>
+                      <a:ext cx="5080000" cy="1693333"/>
+                    </a:xfrm>
+                    <a:prstGeom prst="rect"/>
+                  </pic:spPr>
+                </pic:pic>
+              </a:graphicData>
+            </a:graphic>
+          </wp:inline>
+        </w:drawing>
       </w:r>
     </w:p>
     <w:p>
@@ -218,12 +312,23 @@
         <w:pStyle w:val="Heading2"/>
       </w:pPr>
       <w:r>
-        <w:t>Challenges faced and how solved</w:t>
+        <w:t>Challenges Faced</w:t>
       </w:r>
     </w:p>
     <w:p>
+      <w:pPr>
+        <w:pStyle w:val="ListBullet"/>
+      </w:pPr>
       <w:r>
-        <w:t>Filtering logic to apply conditions properly without overriding values unnecessarily. Solved using dataframe `.loc` with boolean masking.</w:t>
+        <w:t>Handling conditional imputation logic</w:t>
+      </w:r>
+    </w:p>
+    <w:p>
+      <w:pPr>
+        <w:pStyle w:val="ListBullet"/>
+      </w:pPr>
+      <w:r>
+        <w:t>Ensuring fallback median works correctly</w:t>
       </w:r>
     </w:p>
     <w:p>
@@ -231,12 +336,23 @@
         <w:pStyle w:val="Heading2"/>
       </w:pPr>
       <w:r>
-        <w:t>Key insights / observations</w:t>
+        <w:t>Key Insights</w:t>
       </w:r>
     </w:p>
     <w:p>
+      <w:pPr>
+        <w:pStyle w:val="ListBullet"/>
+      </w:pPr>
       <w:r>
-        <w:t>Regional median mapping handles values more explicitly by controlling geographical variance. Category medians act as a safety net when regional subsets are missing.</w:t>
+        <w:t>Regional patterns affect sales values</w:t>
+      </w:r>
+    </w:p>
+    <w:p>
+      <w:pPr>
+        <w:pStyle w:val="ListBullet"/>
+      </w:pPr>
+      <w:r>
+        <w:t>Median-based imputation preserves distribution</w:t>
       </w:r>
     </w:p>
     <w:p>
@@ -249,7 +365,7 @@
         <w:pStyle w:val="Heading1"/>
       </w:pPr>
       <w:r>
-        <w:t>Q2</w:t>
+        <w:t>🔹 Q2: Complex String Manipulation</w:t>
       </w:r>
     </w:p>
     <w:p>
@@ -262,9 +378,7 @@
     </w:p>
     <w:p>
       <w:r>
-        <w:t>Q2. Complex String Manipulation with Duplicate Handling.</w:t>
-        <w:br/>
-        <w:t>Remove titles, split into First, Middle, Last names, format into lower case firstinitial + lastname. Append number to handle duplicate usernames.</w:t>
+        <w:t>Remove titles from employee names, split into parts, generate usernames (first initial + last name), and handle duplicates appropriately.</w:t>
       </w:r>
     </w:p>
     <w:p>
@@ -272,12 +386,39 @@
         <w:pStyle w:val="Heading2"/>
       </w:pPr>
       <w:r>
-        <w:t>Approach / Logic used</w:t>
+        <w:t>Approach / Logic Used</w:t>
       </w:r>
     </w:p>
     <w:p>
+      <w:pPr>
+        <w:pStyle w:val="ListBullet"/>
+      </w:pPr>
       <w:r>
-        <w:t>Applied regex to extract and remove titles. Split the remaining text taking care of variable-length names using a function. Iteratively built username strings and tracked uniqueness using a dictionary counter.</w:t>
+        <w:t>Removed titles using string operations</w:t>
+      </w:r>
+    </w:p>
+    <w:p>
+      <w:pPr>
+        <w:pStyle w:val="ListBullet"/>
+      </w:pPr>
+      <w:r>
+        <w:t>Split names into components</w:t>
+      </w:r>
+    </w:p>
+    <w:p>
+      <w:pPr>
+        <w:pStyle w:val="ListBullet"/>
+      </w:pPr>
+      <w:r>
+        <w:t>Generated usernames using format rules</w:t>
+      </w:r>
+    </w:p>
+    <w:p>
+      <w:pPr>
+        <w:pStyle w:val="ListBullet"/>
+      </w:pPr>
+      <w:r>
+        <w:t>Handled duplicates using counters</w:t>
       </w:r>
     </w:p>
     <w:p>
@@ -285,7 +426,7 @@
         <w:pStyle w:val="Heading2"/>
       </w:pPr>
       <w:r>
-        <w:t>Complete Python Code</w:t>
+        <w:t>Python Code</w:t>
       </w:r>
     </w:p>
     <w:p>
@@ -295,6 +436,7 @@
       <w:r>
         <w:rPr>
           <w:rFonts w:ascii="Courier New" w:hAnsi="Courier New"/>
+          <w:color w:val="2B2B2B"/>
           <w:sz w:val="18"/>
         </w:rPr>
         <w:t>import pandas as pd</w:t>
@@ -404,7 +546,7 @@
         <w:pStyle w:val="Heading2"/>
       </w:pPr>
       <w:r>
-        <w:t>Output / Results</w:t>
+        <w:t>Output</w:t>
       </w:r>
     </w:p>
     <w:p>
@@ -414,7 +556,8 @@
       <w:r>
         <w:rPr>
           <w:rFonts w:ascii="Courier New" w:hAnsi="Courier New"/>
-          <w:sz w:val="20"/>
+          <w:color w:val="2B2B2B"/>
+          <w:sz w:val="18"/>
         </w:rPr>
         <w:t>Final DataFrame (First 8 Rows):</w:t>
         <w:br/>
@@ -446,12 +589,23 @@
         <w:pStyle w:val="Heading2"/>
       </w:pPr>
       <w:r>
-        <w:t>Challenges faced and how solved</w:t>
+        <w:t>Challenges Faced</w:t>
       </w:r>
     </w:p>
     <w:p>
+      <w:pPr>
+        <w:pStyle w:val="ListBullet"/>
+      </w:pPr>
       <w:r>
-        <w:t>Handling names with no middle names or varying name lengths. Addressed by counting string splits and conditionally allocating Name parts.</w:t>
+        <w:t>Handling inconsistent name formats</w:t>
+      </w:r>
+    </w:p>
+    <w:p>
+      <w:pPr>
+        <w:pStyle w:val="ListBullet"/>
+      </w:pPr>
+      <w:r>
+        <w:t>Managing duplicate usernames</w:t>
       </w:r>
     </w:p>
     <w:p>
@@ -459,12 +613,23 @@
         <w:pStyle w:val="Heading2"/>
       </w:pPr>
       <w:r>
-        <w:t>Key insights / observations</w:t>
+        <w:t>Key Insights</w:t>
       </w:r>
     </w:p>
     <w:p>
+      <w:pPr>
+        <w:pStyle w:val="ListBullet"/>
+      </w:pPr>
       <w:r>
-        <w:t>Using dictionary for counting username appearances operates in O(1) time complexity, efficiently solving duplication issues and keeping the generator robust for large logs.</w:t>
+        <w:t>Data cleaning is critical before processing</w:t>
+      </w:r>
+    </w:p>
+    <w:p>
+      <w:pPr>
+        <w:pStyle w:val="ListBullet"/>
+      </w:pPr>
+      <w:r>
+        <w:t>Real-world data often has inconsistencies</w:t>
       </w:r>
     </w:p>
     <w:p>
@@ -477,7 +642,7 @@
         <w:pStyle w:val="Heading1"/>
       </w:pPr>
       <w:r>
-        <w:t>Q6</w:t>
+        <w:t>🔹 Q4: Data Type Optimization Challenge</w:t>
       </w:r>
     </w:p>
     <w:p>
@@ -490,9 +655,7 @@
     </w:p>
     <w:p>
       <w:r>
-        <w:t>Q6. Multi-File Data Wrangling.</w:t>
-        <w:br/>
-        <w:t>Merge student files with exam score files. Calculate average marks per Department per Subject. Pivot data.</w:t>
+        <w:t>Create a DataFrame with 800,000 rows and 10 columns (mix of integers, floats, strings, and dates). Write code to: Print the memory usage before optimization. Downcast all numeric columns to the smallest possible data type. Convert string columns to category type wherever it saves memory. Print the memory usage after optimization. Save the optimized DataFrame in Parquet format. Show the percentage of memory saved.</w:t>
       </w:r>
     </w:p>
     <w:p>
@@ -500,12 +663,55 @@
         <w:pStyle w:val="Heading2"/>
       </w:pPr>
       <w:r>
-        <w:t>Approach / Logic used</w:t>
+        <w:t>Approach / Logic Used</w:t>
       </w:r>
     </w:p>
     <w:p>
+      <w:pPr>
+        <w:pStyle w:val="ListBullet"/>
+      </w:pPr>
       <w:r>
-        <w:t>Used `pd.merge` on StudentID. Then grouped by 'Department' and 'Subject' to find the mean marks. Re-structured using `DataFrame.pivot` with Department as index and Subject as columns.</w:t>
+        <w:t>Generated a dataset of 800,000 rows spanning 10 columns with int, float, string, and datetime variables.</w:t>
+      </w:r>
+    </w:p>
+    <w:p>
+      <w:pPr>
+        <w:pStyle w:val="ListBullet"/>
+      </w:pPr>
+      <w:r>
+        <w:t>Calculated initial memory usage via pandas `memory_usage(deep=True)`.</w:t>
+      </w:r>
+    </w:p>
+    <w:p>
+      <w:pPr>
+        <w:pStyle w:val="ListBullet"/>
+      </w:pPr>
+      <w:r>
+        <w:t>Iterated over numeric columns to dynamically downcast using `pd.to_numeric(downcast=...)`.</w:t>
+      </w:r>
+    </w:p>
+    <w:p>
+      <w:pPr>
+        <w:pStyle w:val="ListBullet"/>
+      </w:pPr>
+      <w:r>
+        <w:t>Checked categorical feasibility for object (string) columns and converted them when unique count &lt; 50% of total length.</w:t>
+      </w:r>
+    </w:p>
+    <w:p>
+      <w:pPr>
+        <w:pStyle w:val="ListBullet"/>
+      </w:pPr>
+      <w:r>
+        <w:t>Saved resulting data to the optimized Parquet format via `to_parquet`.</w:t>
+      </w:r>
+    </w:p>
+    <w:p>
+      <w:pPr>
+        <w:pStyle w:val="ListBullet"/>
+      </w:pPr>
+      <w:r>
+        <w:t>Printed before, after, and percentage size reduced calculations.</w:t>
       </w:r>
     </w:p>
     <w:p>
@@ -513,7 +719,7 @@
         <w:pStyle w:val="Heading2"/>
       </w:pPr>
       <w:r>
-        <w:t>Complete Python Code</w:t>
+        <w:t>Python Code</w:t>
       </w:r>
     </w:p>
     <w:p>
@@ -523,45 +729,124 @@
       <w:r>
         <w:rPr>
           <w:rFonts w:ascii="Courier New" w:hAnsi="Courier New"/>
+          <w:color w:val="2B2B2B"/>
           <w:sz w:val="18"/>
         </w:rPr>
         <w:t>import pandas as pd</w:t>
         <w:br/>
+        <w:t>import numpy as np</w:t>
         <w:br/>
-        <w:t>def wrangle_data():</w:t>
         <w:br/>
-        <w:t xml:space="preserve">    df_student = pd.read_csv('student_personal.csv')</w:t>
+        <w:t>def optimize_dataframe():</w:t>
         <w:br/>
-        <w:t xml:space="preserve">    df_exam = pd.read_csv('exam_scores.csv')</w:t>
+        <w:t xml:space="preserve">    print("Generating DataFrame with 800,000 rows and 10 columns...")</w:t>
+        <w:br/>
+        <w:t xml:space="preserve">    n_rows = 800000</w:t>
         <w:br/>
         <w:t xml:space="preserve">    </w:t>
         <w:br/>
-        <w:t xml:space="preserve">    # Merge both files on StudentID</w:t>
+        <w:t xml:space="preserve">    # 10 columns: mix of integers, floats, strings, and dates</w:t>
         <w:br/>
-        <w:t xml:space="preserve">    merged_df = pd.merge(df_student, df_exam, on='StudentID', how='inner')</w:t>
+        <w:t xml:space="preserve">    data = {</w:t>
+        <w:br/>
+        <w:t xml:space="preserve">        'int_col1': np.random.randint(0, 100, size=n_rows),</w:t>
+        <w:br/>
+        <w:t xml:space="preserve">        'int_col2': np.random.randint(-10000, 10000, size=n_rows),</w:t>
+        <w:br/>
+        <w:t xml:space="preserve">        'float_col1': np.random.rand(n_rows) * 100.0,</w:t>
+        <w:br/>
+        <w:t xml:space="preserve">        'float_col2': np.random.rand(n_rows) * 1000.0,</w:t>
+        <w:br/>
+        <w:t xml:space="preserve">        'str_col1': np.random.choice(['Category A', 'Category B', 'Category C', 'Category D'], size=n_rows),</w:t>
+        <w:br/>
+        <w:t xml:space="preserve">        'str_col2': np.random.choice(['Low', 'Medium', 'High'], size=n_rows),</w:t>
+        <w:br/>
+        <w:t xml:space="preserve">        'str_col3': np.random.choice(['Yes', 'No'], size=n_rows),</w:t>
+        <w:br/>
+        <w:t xml:space="preserve">        'date_col1': pd.date_range('2020-01-01', periods=n_rows, freq='s'),</w:t>
+        <w:br/>
+        <w:t xml:space="preserve">        'date_col2': pd.date_range('2021-01-01', periods=n_rows, freq='s'),</w:t>
+        <w:br/>
+        <w:t xml:space="preserve">        'float_col3': np.random.randn(n_rows) * 50.0</w:t>
+        <w:br/>
+        <w:t xml:space="preserve">    }</w:t>
         <w:br/>
         <w:t xml:space="preserve">    </w:t>
         <w:br/>
-        <w:t xml:space="preserve">    # Calculate the average marks per Department for each Subject</w:t>
-        <w:br/>
-        <w:t xml:space="preserve">    avg_marks = merged_df.groupby(['Department', 'Subject'])['Marks'].mean().reset_index()</w:t>
+        <w:t xml:space="preserve">    df = pd.DataFrame(data)</w:t>
         <w:br/>
         <w:t xml:space="preserve">    </w:t>
         <w:br/>
-        <w:t xml:space="preserve">    # Reshape the result so that each Subject becomes a column</w:t>
+        <w:t xml:space="preserve">    # Print memory usage before optimization</w:t>
         <w:br/>
-        <w:t xml:space="preserve">    pivoted_df = avg_marks.pivot(index='Department', columns='Subject', values='Marks')</w:t>
+        <w:t xml:space="preserve">    initial_memory = df.memory_usage(deep=True).sum()</w:t>
+        <w:br/>
+        <w:t xml:space="preserve">    print(f"Memory Usage Before Optimization: {initial_memory / 1024**2:.2f} MB")</w:t>
         <w:br/>
         <w:t xml:space="preserve">    </w:t>
         <w:br/>
-        <w:t xml:space="preserve">    print("Final Pivoted Table (Average Marks):")</w:t>
+        <w:t xml:space="preserve">    # Optimize numeric columns (downcast)</w:t>
         <w:br/>
-        <w:t xml:space="preserve">    print(pivoted_df)</w:t>
+        <w:t xml:space="preserve">    for col in df.columns:</w:t>
+        <w:br/>
+        <w:t xml:space="preserve">        col_type = df[col].dtype</w:t>
+        <w:br/>
+        <w:t xml:space="preserve">        </w:t>
+        <w:br/>
+        <w:t xml:space="preserve">        if 'int' in str(col_type):</w:t>
+        <w:br/>
+        <w:t xml:space="preserve">            df[col] = pd.to_numeric(df[col], downcast='integer')</w:t>
+        <w:br/>
+        <w:t xml:space="preserve">        elif 'float' in str(col_type):</w:t>
+        <w:br/>
+        <w:t xml:space="preserve">            df[col] = pd.to_numeric(df[col], downcast='float')</w:t>
+        <w:br/>
+        <w:t xml:space="preserve">        elif 'object' in str(col_type):</w:t>
+        <w:br/>
+        <w:t xml:space="preserve">            # Check if converting to category saves memory</w:t>
+        <w:br/>
+        <w:t xml:space="preserve">            num_unique = len(df[col].unique())</w:t>
+        <w:br/>
+        <w:t xml:space="preserve">            num_total = len(df[col])</w:t>
+        <w:br/>
+        <w:t xml:space="preserve">            # If the number of unique values is less than 50% of the total values, convert to category</w:t>
+        <w:br/>
+        <w:t xml:space="preserve">            if num_unique / num_total &lt; 0.5:</w:t>
+        <w:br/>
+        <w:t xml:space="preserve">                df[col] = df[col].astype('category')</w:t>
+        <w:br/>
+        <w:t xml:space="preserve">                </w:t>
+        <w:br/>
+        <w:t xml:space="preserve">    # Print memory usage after optimization</w:t>
+        <w:br/>
+        <w:t xml:space="preserve">    final_memory = df.memory_usage(deep=True).sum()</w:t>
+        <w:br/>
+        <w:t xml:space="preserve">    print(f"Memory Usage After Optimization: {final_memory / 1024**2:.2f} MB")</w:t>
+        <w:br/>
+        <w:t xml:space="preserve">    </w:t>
+        <w:br/>
+        <w:t xml:space="preserve">    # Save optimized dataframe to Parquet format</w:t>
+        <w:br/>
+        <w:t xml:space="preserve">    output_file = 'optimized_data.parquet'</w:t>
+        <w:br/>
+        <w:t xml:space="preserve">    df.to_parquet(output_file)</w:t>
+        <w:br/>
+        <w:t xml:space="preserve">    print(f"Optimized DataFrame saved to {output_file}")</w:t>
+        <w:br/>
+        <w:t xml:space="preserve">    </w:t>
+        <w:br/>
+        <w:t xml:space="preserve">    # Percentage memory saved</w:t>
+        <w:br/>
+        <w:t xml:space="preserve">    memory_saved = initial_memory - final_memory</w:t>
+        <w:br/>
+        <w:t xml:space="preserve">    percentage_saved = (memory_saved / initial_memory) * 100</w:t>
+        <w:br/>
+        <w:t xml:space="preserve">    print(f"Total Memory Saved: {memory_saved / 1024**2:.2f} MB ({percentage_saved:.2f}%)")</w:t>
         <w:br/>
         <w:br/>
         <w:t>if __name__ == "__main__":</w:t>
         <w:br/>
-        <w:t xml:space="preserve">    wrangle_data()</w:t>
+        <w:t xml:space="preserve">    optimize_dataframe()</w:t>
         <w:br/>
       </w:r>
     </w:p>
@@ -570,7 +855,120 @@
         <w:pStyle w:val="Heading2"/>
       </w:pPr>
       <w:r>
-        <w:t>Output / Results</w:t>
+        <w:t>Output</w:t>
+      </w:r>
+    </w:p>
+    <w:p>
+      <w:r>
+        <w:drawing>
+          <wp:inline xmlns:a="http://schemas.openxmlformats.org/drawingml/2006/main" xmlns:pic="http://schemas.openxmlformats.org/drawingml/2006/picture">
+            <wp:extent cx="5080000" cy="1693333"/>
+            <wp:docPr id="2" name="Picture 2"/>
+            <wp:cNvGraphicFramePr>
+              <a:graphicFrameLocks noChangeAspect="1"/>
+            </wp:cNvGraphicFramePr>
+            <a:graphic>
+              <a:graphicData uri="http://schemas.openxmlformats.org/drawingml/2006/picture">
+                <pic:pic>
+                  <pic:nvPicPr>
+                    <pic:cNvPr id="0" name="Q4_output_screenshot.png"/>
+                    <pic:cNvPicPr/>
+                  </pic:nvPicPr>
+                  <pic:blipFill>
+                    <a:blip r:embed="rId10"/>
+                    <a:stretch>
+                      <a:fillRect/>
+                    </a:stretch>
+                  </pic:blipFill>
+                  <pic:spPr>
+                    <a:xfrm>
+                      <a:off x="0" y="0"/>
+                      <a:ext cx="5080000" cy="1693333"/>
+                    </a:xfrm>
+                    <a:prstGeom prst="rect"/>
+                  </pic:spPr>
+                </pic:pic>
+              </a:graphicData>
+            </a:graphic>
+          </wp:inline>
+        </w:drawing>
+      </w:r>
+    </w:p>
+    <w:p>
+      <w:pPr>
+        <w:pStyle w:val="Heading2"/>
+      </w:pPr>
+      <w:r>
+        <w:t>Challenges Faced</w:t>
+      </w:r>
+    </w:p>
+    <w:p>
+      <w:pPr>
+        <w:pStyle w:val="ListBullet"/>
+      </w:pPr>
+      <w:r>
+        <w:t>Identifying correct conditions for logical category conversion.</w:t>
+      </w:r>
+    </w:p>
+    <w:p>
+      <w:pPr>
+        <w:pStyle w:val="ListBullet"/>
+      </w:pPr>
+      <w:r>
+        <w:t>Managing exact sizing metrics over a massive 800k sample frame.</w:t>
+      </w:r>
+    </w:p>
+    <w:p>
+      <w:pPr>
+        <w:pStyle w:val="ListBullet"/>
+      </w:pPr>
+      <w:r>
+        <w:t>Integrating PyArrow backend directly within the pandas engine to allow serialization.</w:t>
+      </w:r>
+    </w:p>
+    <w:p>
+      <w:pPr>
+        <w:pStyle w:val="Heading2"/>
+      </w:pPr>
+      <w:r>
+        <w:t>Key Insights</w:t>
+      </w:r>
+    </w:p>
+    <w:p>
+      <w:pPr>
+        <w:pStyle w:val="ListBullet"/>
+      </w:pPr>
+      <w:r>
+        <w:t>Categorical string reduction significantly minimizes the storage cost of duplicate elements.</w:t>
+      </w:r>
+    </w:p>
+    <w:p>
+      <w:pPr>
+        <w:pStyle w:val="ListBullet"/>
+      </w:pPr>
+      <w:r>
+        <w:t>Downcasting standard floats/ints scales the array blocks dramatically downward.</w:t>
+      </w:r>
+    </w:p>
+    <w:p>
+      <w:pPr>
+        <w:pStyle w:val="ListBullet"/>
+      </w:pPr>
+      <w:r>
+        <w:t>Optimization often achieves over 80% memory savings without any data loss!</w:t>
+      </w:r>
+    </w:p>
+    <w:p>
+      <w:r>
+        <w:br w:type="page"/>
+      </w:r>
+    </w:p>
+    <w:p>
+      <w:pPr>
+        <w:pStyle w:val="Heading1"/>
+      </w:pPr>
+      <w:r>
+        <w:t>🔹 Repository Structure</w:t>
       </w:r>
     </w:p>
     <w:p>
@@ -580,51 +978,46 @@
       <w:r>
         <w:rPr>
           <w:rFonts w:ascii="Courier New" w:hAnsi="Courier New"/>
-          <w:sz w:val="20"/>
+          <w:color w:val="2B2B2B"/>
+          <w:sz w:val="18"/>
         </w:rPr>
-        <w:t>Final Pivoted Table (Average Marks):</w:t>
+        <w:t>DS_Lab_Assignment_MA2411020010018/</w:t>
         <w:br/>
-        <w:t>Subject     Math  Physics</w:t>
+        <w:t>│</w:t>
         <w:br/>
-        <w:t xml:space="preserve">Department               </w:t>
+        <w:t>├── Q1_missing_value_handling.py</w:t>
         <w:br/>
-        <w:t>CSE         88.5     87.5</w:t>
+        <w:t>├── Q2_string_manipulation.py</w:t>
         <w:br/>
-        <w:t>ECE         83.0     86.0</w:t>
+        <w:t>├── Q4_optimization.py</w:t>
         <w:br/>
-        <w:t>MECH        60.0     70.0</w:t>
+        <w:t>│</w:t>
         <w:br/>
-      </w:r>
-    </w:p>
-    <w:p>
-      <w:pPr>
-        <w:pStyle w:val="Heading2"/>
-      </w:pPr>
-      <w:r>
-        <w:t>Challenges faced and how solved</w:t>
-      </w:r>
-    </w:p>
-    <w:p>
-      <w:r>
-        <w:t>Deciding on `how` inner vs outer join constraint. Inner join selected as only students with recorded marks needed computation.</w:t>
-      </w:r>
-    </w:p>
-    <w:p>
-      <w:pPr>
-        <w:pStyle w:val="Heading2"/>
-      </w:pPr>
-      <w:r>
-        <w:t>Key insights / observations</w:t>
-      </w:r>
-    </w:p>
-    <w:p>
-      <w:r>
-        <w:t>Pivoting immediately turns high-volume dimension rows into interpretable aggregated cross-tabulations making it easier to analyze performance comparatively.</w:t>
-      </w:r>
-    </w:p>
-    <w:p>
-      <w:r>
-        <w:br w:type="page"/>
+        <w:t>├── retail_sales.csv</w:t>
+        <w:br/>
+        <w:t>├── employee_master.csv</w:t>
+        <w:br/>
+        <w:t>├── cleaned_retail_sales.csv</w:t>
+        <w:br/>
+        <w:t>├── optimized_data.parquet</w:t>
+        <w:br/>
+        <w:t>│</w:t>
+        <w:br/>
+        <w:t>├── Q1_out.txt</w:t>
+        <w:br/>
+        <w:t>├── Q2_out.txt</w:t>
+        <w:br/>
+        <w:t>├── Q4_out.txt</w:t>
+        <w:br/>
+        <w:t>│</w:t>
+        <w:br/>
+        <w:t>├── Q1_output_screenshot.png</w:t>
+        <w:br/>
+        <w:t>├── Q4_output_screenshot.png</w:t>
+        <w:br/>
+        <w:t>├── README.md</w:t>
+        <w:br/>
+        <w:t>└── MA2411020010018_KaranPullagal_DS_Lab_Assignment_v3.docx</w:t>
       </w:r>
     </w:p>
     <w:sectPr>

</xml_diff>